<commit_message>
feat: added crypto feature
</commit_message>
<xml_diff>
--- a/server/test_data/documents/01_Employer_Selection_Form.docx
+++ b/server/test_data/documents/01_Employer_Selection_Form.docx
@@ -4,7 +4,53 @@
   <w:body>
     <w:p>
       <w:pPr>
-        <w:spacing w:after="100" w:before="200"/>
+        <w:spacing w:after="120" w:before="120"/>
+        <w:jc w:val="center"/>
+      </w:pPr>
+      <w:r>
+        <w:drawing>
+          <wp:inline distT="0" distB="0" distL="0" distR="0">
+            <wp:extent cx="1333500" cy="885825"/>
+            <wp:effectExtent t="0" r="0" b="0" l="0"/>
+            <wp:docPr id="1" name=""/>
+            <wp:cNvGraphicFramePr>
+              <a:graphicFrameLocks xmlns:a="http://schemas.openxmlformats.org/drawingml/2006/main" noChangeAspect="1"/>
+            </wp:cNvGraphicFramePr>
+            <a:graphic xmlns:a="http://schemas.openxmlformats.org/drawingml/2006/main">
+              <a:graphicData uri="http://schemas.openxmlformats.org/drawingml/2006/picture">
+                <pic:pic xmlns:pic="http://schemas.openxmlformats.org/drawingml/2006/picture">
+                  <pic:nvPicPr>
+                    <pic:cNvPr id="0" name="" descr=""/>
+                    <pic:cNvPicPr>
+                      <a:picLocks noChangeAspect="1" noChangeArrowheads="1"/>
+                    </pic:cNvPicPr>
+                  </pic:nvPicPr>
+                  <pic:blipFill>
+                    <a:blip r:embed="rId7" cstate="none"/>
+                    <a:srcRect/>
+                    <a:stretch>
+                      <a:fillRect/>
+                    </a:stretch>
+                  </pic:blipFill>
+                  <pic:spPr bwMode="auto">
+                    <a:xfrm>
+                      <a:off x="0" y="0"/>
+                      <a:ext cx="1333500" cy="885825"/>
+                    </a:xfrm>
+                    <a:prstGeom prst="rect">
+                      <a:avLst/>
+                    </a:prstGeom>
+                  </pic:spPr>
+                </pic:pic>
+              </a:graphicData>
+            </a:graphic>
+          </wp:inline>
+        </w:drawing>
+      </w:r>
+    </w:p>
+    <w:p>
+      <w:pPr>
+        <w:spacing w:after="80" w:before="100"/>
         <w:jc w:val="center"/>
       </w:pPr>
       <w:r>
@@ -21,7 +67,7 @@
     </w:p>
     <w:p>
       <w:pPr>
-        <w:spacing w:after="200" w:before="0"/>
+        <w:spacing w:after="60" w:before="0"/>
         <w:jc w:val="center"/>
       </w:pPr>
       <w:r>
@@ -34,6 +80,20 @@
           <w:szCs w:val="20"/>
         </w:rPr>
         <w:t xml:space="preserve">OFFICIAL NOTICE OF EMPLOYER SELECTION &amp; TRADE SPONSORSHIP</w:t>
+      </w:r>
+    </w:p>
+    <w:p>
+      <w:pPr>
+        <w:spacing w:after="180" w:before="0"/>
+        <w:jc w:val="center"/>
+      </w:pPr>
+      <w:r>
+        <w:rPr>
+          <w:color w:val="64748B"/>
+          <w:sz w:val="16"/>
+          <w:szCs w:val="16"/>
+        </w:rPr>
+        <w:t xml:space="preserve">Licensed Recruitment &amp; Workforce Deployment | Suite 213/35-37 Doody St, Alexandria NSW 2015 | ABN 67 105 263 151</w:t>
       </w:r>
     </w:p>
     <w:tbl>
@@ -137,13 +197,13 @@
     </w:tbl>
     <w:p>
       <w:pPr>
-        <w:spacing w:after="200"/>
+        <w:spacing w:after="160"/>
       </w:pPr>
     </w:p>
     <w:p>
       <w:pPr>
         <w:pStyle w:val="Heading2"/>
-        <w:spacing w:after="100" w:before="180"/>
+        <w:spacing w:after="80" w:before="140"/>
       </w:pPr>
       <w:r>
         <w:rPr>
@@ -153,7 +213,7 @@
           <w:sz w:val="22"/>
           <w:szCs w:val="22"/>
         </w:rPr>
-        <w:t xml:space="preserve">1. OFFICIAL SPONSOR EMPLOYERS LIST</w:t>
+        <w:t xml:space="preserve">1. PARTICIPATING HOST EMPLOYERS &amp; ALLOCATED SLOTS</w:t>
       </w:r>
     </w:p>
     <w:tbl>
@@ -186,7 +246,7 @@
                 <w:bCs/>
                 <w:color w:val="FFFFFF"/>
               </w:rPr>
-              <w:t xml:space="preserve">Host Employer</w:t>
+              <w:t xml:space="preserve">Host Mining Employer</w:t>
             </w:r>
           </w:p>
         </w:tc>
@@ -201,7 +261,7 @@
                 <w:bCs/>
                 <w:color w:val="FFFFFF"/>
               </w:rPr>
-              <w:t xml:space="preserve">Target Role</w:t>
+              <w:t xml:space="preserve">Target FIFO Trade Stream</w:t>
             </w:r>
           </w:p>
         </w:tc>
@@ -231,7 +291,7 @@
                 <w:bCs/>
                 <w:color w:val="FFFFFF"/>
               </w:rPr>
-              <w:t xml:space="preserve">Status</w:t>
+              <w:t xml:space="preserve">Sponsorship Status</w:t>
             </w:r>
           </w:p>
         </w:tc>
@@ -241,18 +301,18 @@
           <w:tcPr>
             <w:tcMar>
               <w:top w:type="dxa" w:w="80"/>
-              <w:left w:type="dxa" w:w="100"/>
+              <w:left w:type="dxa" w:w="80"/>
               <w:bottom w:type="dxa" w:w="80"/>
-              <w:right w:type="dxa" w:w="100"/>
-            </w:tcMar>
-          </w:tcPr>
-          <w:p>
-            <w:r>
-              <w:rPr>
-                <w:b/>
-                <w:bCs/>
-              </w:rPr>
-              <w:t xml:space="preserve">MACA LIMITED</w:t>
+              <w:right w:type="dxa" w:w="80"/>
+            </w:tcMar>
+          </w:tcPr>
+          <w:p>
+            <w:r>
+              <w:rPr>
+                <w:b/>
+                <w:bCs/>
+              </w:rPr>
+              <w:t xml:space="preserve">MACA Limited</w:t>
             </w:r>
           </w:p>
         </w:tc>
@@ -260,9 +320,9 @@
           <w:tcPr>
             <w:tcMar>
               <w:top w:type="dxa" w:w="80"/>
-              <w:left w:type="dxa" w:w="100"/>
+              <w:left w:type="dxa" w:w="80"/>
               <w:bottom w:type="dxa" w:w="80"/>
-              <w:right w:type="dxa" w:w="100"/>
+              <w:right w:type="dxa" w:w="80"/>
             </w:tcMar>
           </w:tcPr>
           <w:p>
@@ -275,14 +335,14 @@
           <w:tcPr>
             <w:tcMar>
               <w:top w:type="dxa" w:w="80"/>
-              <w:left w:type="dxa" w:w="100"/>
+              <w:left w:type="dxa" w:w="80"/>
               <w:bottom w:type="dxa" w:w="80"/>
-              <w:right w:type="dxa" w:w="100"/>
-            </w:tcMar>
-          </w:tcPr>
-          <w:p>
-            <w:r>
-              <w:t xml:space="preserve">5 Active Positions</w:t>
+              <w:right w:type="dxa" w:w="80"/>
+            </w:tcMar>
+          </w:tcPr>
+          <w:p>
+            <w:r>
+              <w:t xml:space="preserve">3 Active Positions</w:t>
             </w:r>
           </w:p>
         </w:tc>
@@ -290,9 +350,9 @@
           <w:tcPr>
             <w:tcMar>
               <w:top w:type="dxa" w:w="80"/>
-              <w:left w:type="dxa" w:w="100"/>
+              <w:left w:type="dxa" w:w="80"/>
               <w:bottom w:type="dxa" w:w="80"/>
-              <w:right w:type="dxa" w:w="100"/>
+              <w:right w:type="dxa" w:w="80"/>
             </w:tcMar>
           </w:tcPr>
           <w:p>
@@ -302,7 +362,220 @@
                 <w:bCs/>
                 <w:color w:val="15803D"/>
               </w:rPr>
-              <w:t xml:space="preserve">Currently Employing (Active Sponsor)</w:t>
+              <w:t xml:space="preserve">Active Sponsor (Approved 482)</w:t>
+            </w:r>
+          </w:p>
+        </w:tc>
+      </w:tr>
+      <w:tr>
+        <w:tc>
+          <w:tcPr>
+            <w:tcMar>
+              <w:top w:type="dxa" w:w="80"/>
+              <w:left w:type="dxa" w:w="80"/>
+              <w:bottom w:type="dxa" w:w="80"/>
+              <w:right w:type="dxa" w:w="80"/>
+            </w:tcMar>
+          </w:tcPr>
+          <w:p>
+            <w:r>
+              <w:rPr>
+                <w:b/>
+                <w:bCs/>
+              </w:rPr>
+              <w:t xml:space="preserve">Mineral Resources Limited</w:t>
+            </w:r>
+          </w:p>
+        </w:tc>
+        <w:tc>
+          <w:tcPr>
+            <w:tcMar>
+              <w:top w:type="dxa" w:w="80"/>
+              <w:left w:type="dxa" w:w="80"/>
+              <w:bottom w:type="dxa" w:w="80"/>
+              <w:right w:type="dxa" w:w="80"/>
+            </w:tcMar>
+          </w:tcPr>
+          <w:p>
+            <w:r>
+              <w:t xml:space="preserve">SITE ENGINEER  – FIFO (PERTH, WA)</w:t>
+            </w:r>
+          </w:p>
+        </w:tc>
+        <w:tc>
+          <w:tcPr>
+            <w:tcMar>
+              <w:top w:type="dxa" w:w="80"/>
+              <w:left w:type="dxa" w:w="80"/>
+              <w:bottom w:type="dxa" w:w="80"/>
+              <w:right w:type="dxa" w:w="80"/>
+            </w:tcMar>
+          </w:tcPr>
+          <w:p>
+            <w:r>
+              <w:t xml:space="preserve">2 Active Positions</w:t>
+            </w:r>
+          </w:p>
+        </w:tc>
+        <w:tc>
+          <w:tcPr>
+            <w:tcMar>
+              <w:top w:type="dxa" w:w="80"/>
+              <w:left w:type="dxa" w:w="80"/>
+              <w:bottom w:type="dxa" w:w="80"/>
+              <w:right w:type="dxa" w:w="80"/>
+            </w:tcMar>
+          </w:tcPr>
+          <w:p>
+            <w:r>
+              <w:rPr>
+                <w:b/>
+                <w:bCs/>
+                <w:color w:val="15803D"/>
+              </w:rPr>
+              <w:t xml:space="preserve">Active Sponsor (Approved 482)</w:t>
+            </w:r>
+          </w:p>
+        </w:tc>
+      </w:tr>
+      <w:tr>
+        <w:tc>
+          <w:tcPr>
+            <w:tcMar>
+              <w:top w:type="dxa" w:w="80"/>
+              <w:left w:type="dxa" w:w="80"/>
+              <w:bottom w:type="dxa" w:w="80"/>
+              <w:right w:type="dxa" w:w="80"/>
+            </w:tcMar>
+          </w:tcPr>
+          <w:p>
+            <w:r>
+              <w:rPr>
+                <w:b/>
+                <w:bCs/>
+              </w:rPr>
+              <w:t xml:space="preserve">Northern Star Resources Ltd.</w:t>
+            </w:r>
+          </w:p>
+        </w:tc>
+        <w:tc>
+          <w:tcPr>
+            <w:tcMar>
+              <w:top w:type="dxa" w:w="80"/>
+              <w:left w:type="dxa" w:w="80"/>
+              <w:bottom w:type="dxa" w:w="80"/>
+              <w:right w:type="dxa" w:w="80"/>
+            </w:tcMar>
+          </w:tcPr>
+          <w:p>
+            <w:r>
+              <w:t xml:space="preserve">SITE ENGINEER  – FIFO (PERTH, WA)</w:t>
+            </w:r>
+          </w:p>
+        </w:tc>
+        <w:tc>
+          <w:tcPr>
+            <w:tcMar>
+              <w:top w:type="dxa" w:w="80"/>
+              <w:left w:type="dxa" w:w="80"/>
+              <w:bottom w:type="dxa" w:w="80"/>
+              <w:right w:type="dxa" w:w="80"/>
+            </w:tcMar>
+          </w:tcPr>
+          <w:p>
+            <w:r>
+              <w:t xml:space="preserve">2 Active Positions</w:t>
+            </w:r>
+          </w:p>
+        </w:tc>
+        <w:tc>
+          <w:tcPr>
+            <w:tcMar>
+              <w:top w:type="dxa" w:w="80"/>
+              <w:left w:type="dxa" w:w="80"/>
+              <w:bottom w:type="dxa" w:w="80"/>
+              <w:right w:type="dxa" w:w="80"/>
+            </w:tcMar>
+          </w:tcPr>
+          <w:p>
+            <w:r>
+              <w:rPr>
+                <w:b/>
+                <w:bCs/>
+                <w:color w:val="15803D"/>
+              </w:rPr>
+              <w:t xml:space="preserve">Active Sponsor (Approved 482)</w:t>
+            </w:r>
+          </w:p>
+        </w:tc>
+      </w:tr>
+      <w:tr>
+        <w:tc>
+          <w:tcPr>
+            <w:tcMar>
+              <w:top w:type="dxa" w:w="80"/>
+              <w:left w:type="dxa" w:w="80"/>
+              <w:bottom w:type="dxa" w:w="80"/>
+              <w:right w:type="dxa" w:w="80"/>
+            </w:tcMar>
+          </w:tcPr>
+          <w:p>
+            <w:r>
+              <w:rPr>
+                <w:b/>
+                <w:bCs/>
+              </w:rPr>
+              <w:t xml:space="preserve">Rio Tinto</w:t>
+            </w:r>
+          </w:p>
+        </w:tc>
+        <w:tc>
+          <w:tcPr>
+            <w:tcMar>
+              <w:top w:type="dxa" w:w="80"/>
+              <w:left w:type="dxa" w:w="80"/>
+              <w:bottom w:type="dxa" w:w="80"/>
+              <w:right w:type="dxa" w:w="80"/>
+            </w:tcMar>
+          </w:tcPr>
+          <w:p>
+            <w:r>
+              <w:t xml:space="preserve">SITE ENGINEER  – FIFO (PERTH, WA)</w:t>
+            </w:r>
+          </w:p>
+        </w:tc>
+        <w:tc>
+          <w:tcPr>
+            <w:tcMar>
+              <w:top w:type="dxa" w:w="80"/>
+              <w:left w:type="dxa" w:w="80"/>
+              <w:bottom w:type="dxa" w:w="80"/>
+              <w:right w:type="dxa" w:w="80"/>
+            </w:tcMar>
+          </w:tcPr>
+          <w:p>
+            <w:r>
+              <w:t xml:space="preserve">3 Active Positions</w:t>
+            </w:r>
+          </w:p>
+        </w:tc>
+        <w:tc>
+          <w:tcPr>
+            <w:tcMar>
+              <w:top w:type="dxa" w:w="80"/>
+              <w:left w:type="dxa" w:w="80"/>
+              <w:bottom w:type="dxa" w:w="80"/>
+              <w:right w:type="dxa" w:w="80"/>
+            </w:tcMar>
+          </w:tcPr>
+          <w:p>
+            <w:r>
+              <w:rPr>
+                <w:b/>
+                <w:bCs/>
+                <w:color w:val="15803D"/>
+              </w:rPr>
+              <w:t xml:space="preserve">Active Sponsor (Approved 482)</w:t>
             </w:r>
           </w:p>
         </w:tc>
@@ -310,8 +583,18 @@
     </w:tbl>
     <w:p>
       <w:pPr>
-        <w:spacing w:after="160"/>
-      </w:pPr>
+        <w:spacing w:after="140" w:before="80"/>
+      </w:pPr>
+      <w:r>
+        <w:rPr>
+          <w:i/>
+          <w:iCs/>
+          <w:color w:val="475569"/>
+          <w:sz w:val="18"/>
+          <w:szCs w:val="18"/>
+        </w:rPr>
+        <w:t xml:space="preserve">Total Host Employer Positions Available: 10 | Total Nominated Candidate Pool: 12 qualified candidates (Sum of slots + 2). Slots are locked in order of signed document submission and ticket commencement.</w:t>
+      </w:r>
     </w:p>
     <w:tbl>
       <w:tblPr>
@@ -378,13 +661,13 @@
     </w:tbl>
     <w:p>
       <w:pPr>
-        <w:spacing w:after="200"/>
+        <w:spacing w:after="180"/>
       </w:pPr>
     </w:p>
     <w:p>
       <w:pPr>
         <w:pStyle w:val="Heading2"/>
-        <w:spacing w:after="100" w:before="180"/>
+        <w:spacing w:after="80" w:before="140"/>
       </w:pPr>
       <w:r>
         <w:rPr>
@@ -403,12 +686,12 @@
           <w:sz w:val="20"/>
           <w:szCs w:val="20"/>
         </w:rPr>
-        <w:t xml:space="preserve">I, Nnamdi Iroagba, formally confirm my selection of MACA LIMITED as my nominated sponsoring employer for the position of SITE ENGINEER  – FIFO (PERTH, WA). I understand that upon completion of my competency tickets with CertHero RTO, MACA LIMITED will proceed with my Subclass 482 visa nomination and Australian site mobilisation.</w:t>
+        <w:t xml:space="preserve">I, Nnamdi Iroagba, formally confirm my selection of MACA LIMITED as my nominated sponsoring employer for the position of SITE ENGINEER  – FIFO (PERTH, WA). I understand that upon completion of prerequisite competency tickets with CertHero RTO, MACA LIMITED will proceed with my Subclass 482 visa nomination and Australian site mobilisation.</w:t>
       </w:r>
     </w:p>
     <w:p>
       <w:pPr>
-        <w:spacing w:after="100" w:before="300"/>
+        <w:spacing w:after="80" w:before="240"/>
       </w:pPr>
     </w:p>
     <w:tbl>

</xml_diff>